<commit_message>
atualização das duplicatas e formatos
</commit_message>
<xml_diff>
--- a/Relatorio_NOTURNO.docx
+++ b/Relatorio_NOTURNO.docx
@@ -93,7 +93,7 @@
               <w:rPr>
                 <w:b/>
               </w:rPr>
-              <w:t>Membros</w:t>
+              <w:t>Banca / Intérprete</w:t>
             </w:r>
           </w:p>
         </w:tc>
@@ -125,7 +125,7 @@
           </w:tcPr>
           <w:p>
             <w:r>
-              <w:t>Joseanne Kanufre Pires Ferreira</w:t>
+              <w:t>Leonilda de Oliveira Antunes</w:t>
             </w:r>
           </w:p>
         </w:tc>
@@ -135,7 +135,7 @@
           </w:tcPr>
           <w:p>
             <w:r>
-              <w:t>Andréa Correa Paraiso Müller</w:t>
+              <w:t>Marco Aurélio de Souza</w:t>
             </w:r>
           </w:p>
         </w:tc>
@@ -145,7 +145,7 @@
           </w:tcPr>
           <w:p>
             <w:r>
-              <w:t>Juliana Ristow Canuto, Jannefer Desselman</w:t>
+              <w:t>Membros: Ligia Paula Couto, Thiago Alexandre Correa</w:t>
             </w:r>
           </w:p>
         </w:tc>
@@ -177,7 +177,7 @@
           </w:tcPr>
           <w:p>
             <w:r>
-              <w:t xml:space="preserve">Ellen Andrade </w:t>
+              <w:t>Lidiane Patrine Mendes Batista</w:t>
             </w:r>
           </w:p>
         </w:tc>
@@ -187,7 +187,7 @@
           </w:tcPr>
           <w:p>
             <w:r>
-              <w:t>Keli Cristina Pacheco</w:t>
+              <w:t>Joana dArc Martins Pupo</w:t>
             </w:r>
           </w:p>
         </w:tc>
@@ -197,7 +197,7 @@
           </w:tcPr>
           <w:p>
             <w:r>
-              <w:t>Jane Kelly de Oliveira, Carlos André Ferreira</w:t>
+              <w:t>Membros: Cloris Porto Torquato, Névio de Campos</w:t>
             </w:r>
           </w:p>
         </w:tc>
@@ -249,7 +249,7 @@
           </w:tcPr>
           <w:p>
             <w:r>
-              <w:t>Rúbia Carla da Silva, Eliane Santos Raupp</w:t>
+              <w:t>Membros: Rúbia Carla da Silva, Eliane Santos Raupp</w:t>
             </w:r>
           </w:p>
         </w:tc>
@@ -281,7 +281,7 @@
           </w:tcPr>
           <w:p>
             <w:r>
-              <w:t xml:space="preserve">Guilherme Mayer Axt </w:t>
+              <w:t>Ana Carolina Troyner Yamamoto</w:t>
             </w:r>
           </w:p>
         </w:tc>
@@ -291,7 +291,7 @@
           </w:tcPr>
           <w:p>
             <w:r>
-              <w:t xml:space="preserve">Cloris Porto Torquato </w:t>
+              <w:t xml:space="preserve">Keli Cristina Pacheco </w:t>
             </w:r>
           </w:p>
         </w:tc>
@@ -301,7 +301,7 @@
           </w:tcPr>
           <w:p>
             <w:r>
-              <w:t>Alyda Henrietta Zomer,  Giuliano Lellis Ito Santos</w:t>
+              <w:t>Membros: Eunice de Morais, Daiane Cristina Pereira</w:t>
             </w:r>
           </w:p>
         </w:tc>
@@ -333,7 +333,7 @@
           </w:tcPr>
           <w:p>
             <w:r>
-              <w:t>Leonilda de Oliveira Antunes</w:t>
+              <w:t>Alanis Cristine Barros</w:t>
             </w:r>
           </w:p>
         </w:tc>
@@ -343,7 +343,7 @@
           </w:tcPr>
           <w:p>
             <w:r>
-              <w:t>Marco Aurélio de Souza</w:t>
+              <w:t>Bhianca Moro Portella</w:t>
             </w:r>
           </w:p>
         </w:tc>
@@ -353,7 +353,9 @@
           </w:tcPr>
           <w:p>
             <w:r>
-              <w:t>Ligia Paula Couto, Thiago Alexandre Correa</w:t>
+              <w:t>Coorientador(a): Fabiana Simeoni Avais</w:t>
+              <w:br/>
+              <w:t>Membros: João Victor Chiquetto Silva, Ana Letícia Carneiro de Oliveira</w:t>
             </w:r>
           </w:p>
         </w:tc>
@@ -385,7 +387,7 @@
           </w:tcPr>
           <w:p>
             <w:r>
-              <w:t>Heridiano Pacheco dos Santos</w:t>
+              <w:t>Rodrigo Vaz Alvarez Gonzales</w:t>
             </w:r>
           </w:p>
         </w:tc>
@@ -395,7 +397,7 @@
           </w:tcPr>
           <w:p>
             <w:r>
-              <w:t>Fabiana Simeoni Avais</w:t>
+              <w:t>Rosangela Schardong</w:t>
             </w:r>
           </w:p>
         </w:tc>
@@ -405,7 +407,7 @@
           </w:tcPr>
           <w:p>
             <w:r>
-              <w:t>Rubia Carla da Silva, Alyda Zomer</w:t>
+              <w:t>Membros: Giuliano Lellis Ito Santos, Lincoln Felipe Freitas</w:t>
             </w:r>
           </w:p>
         </w:tc>
@@ -437,7 +439,7 @@
           </w:tcPr>
           <w:p>
             <w:r>
-              <w:t>Estefany Ferreira Carvalho</w:t>
+              <w:t>Ana Julia Ruths de Castro</w:t>
             </w:r>
           </w:p>
         </w:tc>
@@ -447,7 +449,7 @@
           </w:tcPr>
           <w:p>
             <w:r>
-              <w:t>Rosangela Schardong</w:t>
+              <w:t>Evanir Pavloski</w:t>
             </w:r>
           </w:p>
         </w:tc>
@@ -457,7 +459,7 @@
           </w:tcPr>
           <w:p>
             <w:r>
-              <w:t>Valeska Gracioso Carlos , Lincoln Felipe Freitas</w:t>
+              <w:t>Membros: Deborah Scheidt, Eunice de Morais</w:t>
             </w:r>
           </w:p>
         </w:tc>
@@ -489,7 +491,7 @@
           </w:tcPr>
           <w:p>
             <w:r>
-              <w:t>Lidiane Patrine Mendes Batista</w:t>
+              <w:t xml:space="preserve">Pamela Cristina Rodrigues </w:t>
             </w:r>
           </w:p>
         </w:tc>
@@ -499,7 +501,7 @@
           </w:tcPr>
           <w:p>
             <w:r>
-              <w:t>Joana dArc Martins Pupo</w:t>
+              <w:t>Charlott Eloize Leviski</w:t>
             </w:r>
           </w:p>
         </w:tc>
@@ -509,7 +511,7 @@
           </w:tcPr>
           <w:p>
             <w:r>
-              <w:t>Clóris Porto Torquato, Névio de Campos</w:t>
+              <w:t>Membros: Simone de Fátima Colman Martins, Juliana Ristow Canuto</w:t>
             </w:r>
           </w:p>
         </w:tc>
@@ -541,7 +543,7 @@
           </w:tcPr>
           <w:p>
             <w:r>
-              <w:t>EMANUELLY MAUDA SCOS</w:t>
+              <w:t>NÚBIA DE BRAGA COTA MENDES</w:t>
             </w:r>
           </w:p>
         </w:tc>
@@ -551,7 +553,7 @@
           </w:tcPr>
           <w:p>
             <w:r>
-              <w:t>Rúbia Carla da Silva</w:t>
+              <w:t>Andressa França</w:t>
             </w:r>
           </w:p>
         </w:tc>
@@ -561,7 +563,7 @@
           </w:tcPr>
           <w:p>
             <w:r>
-              <w:t>Andressa França, Joyce Cristina Souza</w:t>
+              <w:t>Membros: Vinícius Heitor Pereira, Sandra Cristina Demschinski</w:t>
             </w:r>
           </w:p>
         </w:tc>
@@ -593,7 +595,7 @@
           </w:tcPr>
           <w:p>
             <w:r>
-              <w:t xml:space="preserve">Pamela Cristina Rodrigues </w:t>
+              <w:t xml:space="preserve">Ellen Andrade </w:t>
             </w:r>
           </w:p>
         </w:tc>
@@ -603,7 +605,7 @@
           </w:tcPr>
           <w:p>
             <w:r>
-              <w:t>Charlott Eloize Leviski</w:t>
+              <w:t>Keli Cristina Pacheco</w:t>
             </w:r>
           </w:p>
         </w:tc>
@@ -613,7 +615,7 @@
           </w:tcPr>
           <w:p>
             <w:r>
-              <w:t>Simone de Fátima Colman Martins, Juliana Ristow Canuto</w:t>
+              <w:t>Membros: Jane Kelly de Oliveira, Carlos André Ferreira</w:t>
             </w:r>
           </w:p>
         </w:tc>
@@ -645,7 +647,7 @@
           </w:tcPr>
           <w:p>
             <w:r>
-              <w:t>Andréia Rosane Bueno da Silva</w:t>
+              <w:t>Heridiano Pacheco dos Santos</w:t>
             </w:r>
           </w:p>
         </w:tc>
@@ -655,7 +657,7 @@
           </w:tcPr>
           <w:p>
             <w:r>
-              <w:t>Vinícius Heitor Pereira</w:t>
+              <w:t>Fabiana Simeoni Avais</w:t>
             </w:r>
           </w:p>
         </w:tc>
@@ -665,7 +667,7 @@
           </w:tcPr>
           <w:p>
             <w:r>
-              <w:t>Katherine Fischer , Carlos André Ferreira, Precisa de TILSP pois terá uma professora surda na banca</w:t>
+              <w:t>Membros: Rúbia Carla da Silva, Ályda Henrietta Zomer</w:t>
             </w:r>
           </w:p>
         </w:tc>
@@ -717,59 +719,7 @@
           </w:tcPr>
           <w:p>
             <w:r>
-              <w:t xml:space="preserve">Giuliano Lellis Ito Santos, Patricia Barreto Mainardi Maeso </w:t>
-            </w:r>
-          </w:p>
-        </w:tc>
-      </w:tr>
-      <w:tr>
-        <w:tc>
-          <w:tcPr>
-            <w:tcW w:type="dxa" w:w="1728"/>
-          </w:tcPr>
-          <w:p>
-            <w:r>
-              <w:t>21:05</w:t>
-            </w:r>
-          </w:p>
-        </w:tc>
-        <w:tc>
-          <w:tcPr>
-            <w:tcW w:type="dxa" w:w="1728"/>
-          </w:tcPr>
-          <w:p>
-            <w:r>
-              <w:t>B201</w:t>
-            </w:r>
-          </w:p>
-        </w:tc>
-        <w:tc>
-          <w:tcPr>
-            <w:tcW w:type="dxa" w:w="1728"/>
-          </w:tcPr>
-          <w:p>
-            <w:r>
-              <w:t>Giulliana Pinheiro</w:t>
-            </w:r>
-          </w:p>
-        </w:tc>
-        <w:tc>
-          <w:tcPr>
-            <w:tcW w:type="dxa" w:w="1728"/>
-          </w:tcPr>
-          <w:p>
-            <w:r>
-              <w:t>Patricia Barreto Mainardi Maeso</w:t>
-            </w:r>
-          </w:p>
-        </w:tc>
-        <w:tc>
-          <w:tcPr>
-            <w:tcW w:type="dxa" w:w="1728"/>
-          </w:tcPr>
-          <w:p>
-            <w:r>
-              <w:t xml:space="preserve">Isabel Cristina Vollet Marson, Deborah Scheidt </w:t>
+              <w:t>Membros: Giuliano Lellis Ito Santos, Patricia Barreto Mainardi Maeso</w:t>
             </w:r>
           </w:p>
         </w:tc>
@@ -801,7 +751,7 @@
           </w:tcPr>
           <w:p>
             <w:r>
-              <w:t>Rodrigo Vaz Alvarez Gonzales</w:t>
+              <w:t>Rafael Milek Weinert</w:t>
             </w:r>
           </w:p>
         </w:tc>
@@ -811,7 +761,7 @@
           </w:tcPr>
           <w:p>
             <w:r>
-              <w:t>Rosangela Schardong</w:t>
+              <w:t>Marco Aurélio de Souza</w:t>
             </w:r>
           </w:p>
         </w:tc>
@@ -821,7 +771,7 @@
           </w:tcPr>
           <w:p>
             <w:r>
-              <w:t>Giuliano Lellis Ito Santos, Lincoln Felipe Freitas</w:t>
+              <w:t>Membros: Evanir Pavloski, Felipe Teodoro da Silva</w:t>
             </w:r>
           </w:p>
         </w:tc>
@@ -853,7 +803,7 @@
           </w:tcPr>
           <w:p>
             <w:r>
-              <w:t>Ana Carolina Troyner Yamamoto</w:t>
+              <w:t xml:space="preserve">Guilherme Mayer Axt </w:t>
             </w:r>
           </w:p>
         </w:tc>
@@ -863,7 +813,7 @@
           </w:tcPr>
           <w:p>
             <w:r>
-              <w:t xml:space="preserve">Keli Cristina Pacheco </w:t>
+              <w:t xml:space="preserve">Cloris Porto Torquato </w:t>
             </w:r>
           </w:p>
         </w:tc>
@@ -873,59 +823,7 @@
           </w:tcPr>
           <w:p>
             <w:r>
-              <w:t>Eunice de Morais, Daiane Cristina Pereira</w:t>
-            </w:r>
-          </w:p>
-        </w:tc>
-      </w:tr>
-      <w:tr>
-        <w:tc>
-          <w:tcPr>
-            <w:tcW w:type="dxa" w:w="1728"/>
-          </w:tcPr>
-          <w:p>
-            <w:r>
-              <w:t>21:05</w:t>
-            </w:r>
-          </w:p>
-        </w:tc>
-        <w:tc>
-          <w:tcPr>
-            <w:tcW w:type="dxa" w:w="1728"/>
-          </w:tcPr>
-          <w:p>
-            <w:r>
-              <w:t>B208</w:t>
-            </w:r>
-          </w:p>
-        </w:tc>
-        <w:tc>
-          <w:tcPr>
-            <w:tcW w:type="dxa" w:w="1728"/>
-          </w:tcPr>
-          <w:p>
-            <w:r>
-              <w:t>SERGIO DE SOUZA CAMPISTA JUNIOR</w:t>
-            </w:r>
-          </w:p>
-        </w:tc>
-        <w:tc>
-          <w:tcPr>
-            <w:tcW w:type="dxa" w:w="1728"/>
-          </w:tcPr>
-          <w:p>
-            <w:r>
-              <w:t>Rúbia Carla da Silva e Djane Antonucci Correa</w:t>
-            </w:r>
-          </w:p>
-        </w:tc>
-        <w:tc>
-          <w:tcPr>
-            <w:tcW w:type="dxa" w:w="1728"/>
-          </w:tcPr>
-          <w:p>
-            <w:r>
-              <w:t>Cloris Porto Torquato, Katherine Fischer, TILSP - Valdemir Pontes Vieira</w:t>
+              <w:t>Membros: Ályda Henrietta Zomer, Giuliano Lellis Ito Santos</w:t>
             </w:r>
           </w:p>
         </w:tc>
@@ -977,7 +875,7 @@
           </w:tcPr>
           <w:p>
             <w:r>
-              <w:t>Andressa França , Izabele Caroline Rodrigues Gomes</w:t>
+              <w:t>Membros: Andressa França, Izabele Caroline Rodrigues Gomes</w:t>
             </w:r>
           </w:p>
         </w:tc>
@@ -1009,7 +907,7 @@
           </w:tcPr>
           <w:p>
             <w:r>
-              <w:t>Rafael Milek Weinert</w:t>
+              <w:t>CARLA ANDRESSA RODRIGUES DE ASSUNÇÃO</w:t>
             </w:r>
           </w:p>
         </w:tc>
@@ -1019,7 +917,7 @@
           </w:tcPr>
           <w:p>
             <w:r>
-              <w:t>Marco Aurélio de Souza</w:t>
+              <w:t xml:space="preserve">Marcos Barbosa Carreira </w:t>
             </w:r>
           </w:p>
         </w:tc>
@@ -1029,7 +927,9 @@
           </w:tcPr>
           <w:p>
             <w:r>
-              <w:t>Evanir Pavloski, Felipe Teodoro da Silva</w:t>
+              <w:t>Coorientador(a): Fabiana Simeoni Avais</w:t>
+              <w:br/>
+              <w:t>Membros: Diogo Simão, Álvaro Kasuaki Fujihara</w:t>
             </w:r>
           </w:p>
         </w:tc>
@@ -1081,7 +981,7 @@
           </w:tcPr>
           <w:p>
             <w:r>
-              <w:t>Pascoalina Bailon de Oliveira Saleh, Márcia Cristina do Carmo, Gisele Maciel</w:t>
+              <w:t>Membros: Gisele Maciel, Márcia Cristina do Carmo</w:t>
             </w:r>
           </w:p>
         </w:tc>
@@ -1170,7 +1070,7 @@
               <w:rPr>
                 <w:b/>
               </w:rPr>
-              <w:t>Membros</w:t>
+              <w:t>Banca / Intérprete</w:t>
             </w:r>
           </w:p>
         </w:tc>
@@ -1202,7 +1102,7 @@
           </w:tcPr>
           <w:p>
             <w:r>
-              <w:t>Andrey Eduardo Malinoscky</w:t>
+              <w:t>Naiane Maria de Lima</w:t>
             </w:r>
           </w:p>
         </w:tc>
@@ -1212,7 +1112,7 @@
           </w:tcPr>
           <w:p>
             <w:r>
-              <w:t>Evanir Pavloski</w:t>
+              <w:t>Silvana Oliveira</w:t>
             </w:r>
           </w:p>
         </w:tc>
@@ -1222,7 +1122,59 @@
           </w:tcPr>
           <w:p>
             <w:r>
-              <w:t>Giuliano Lellis dos Santos, Keli Cristina Pacheco</w:t>
+              <w:t>Membros: Lincoln Felipe Freitas, Daiane Cristina Pereira</w:t>
+            </w:r>
+          </w:p>
+        </w:tc>
+      </w:tr>
+      <w:tr>
+        <w:tc>
+          <w:tcPr>
+            <w:tcW w:type="dxa" w:w="1728"/>
+          </w:tcPr>
+          <w:p>
+            <w:r>
+              <w:t>18:50</w:t>
+            </w:r>
+          </w:p>
+        </w:tc>
+        <w:tc>
+          <w:tcPr>
+            <w:tcW w:type="dxa" w:w="1728"/>
+          </w:tcPr>
+          <w:p>
+            <w:r>
+              <w:t>B202</w:t>
+            </w:r>
+          </w:p>
+        </w:tc>
+        <w:tc>
+          <w:tcPr>
+            <w:tcW w:type="dxa" w:w="1728"/>
+          </w:tcPr>
+          <w:p>
+            <w:r>
+              <w:t>ESTELA MARTINS EIDAM</w:t>
+            </w:r>
+          </w:p>
+        </w:tc>
+        <w:tc>
+          <w:tcPr>
+            <w:tcW w:type="dxa" w:w="1728"/>
+          </w:tcPr>
+          <w:p>
+            <w:r>
+              <w:t>Valeska Gracioso Carlos</w:t>
+            </w:r>
+          </w:p>
+        </w:tc>
+        <w:tc>
+          <w:tcPr>
+            <w:tcW w:type="dxa" w:w="1728"/>
+          </w:tcPr>
+          <w:p>
+            <w:r>
+              <w:t>Membros: Lucimar Araujo Braga, Marina Zavadzki</w:t>
             </w:r>
           </w:p>
         </w:tc>
@@ -1254,7 +1206,7 @@
           </w:tcPr>
           <w:p>
             <w:r>
-              <w:t>NÚBIA DE BRAGA COTA MENDES</w:t>
+              <w:t>EMANUELLY MAUDA SCOS</w:t>
             </w:r>
           </w:p>
         </w:tc>
@@ -1264,7 +1216,7 @@
           </w:tcPr>
           <w:p>
             <w:r>
-              <w:t>Andressa França</w:t>
+              <w:t>Rúbia Carla da Silva</w:t>
             </w:r>
           </w:p>
         </w:tc>
@@ -1274,7 +1226,7 @@
           </w:tcPr>
           <w:p>
             <w:r>
-              <w:t>Vinicius Heitor Pereira, Sandra Cristina Demschinski</w:t>
+              <w:t>Membros: Andressa França, Joyce Cristina Souza</w:t>
             </w:r>
           </w:p>
         </w:tc>
@@ -1306,7 +1258,7 @@
           </w:tcPr>
           <w:p>
             <w:r>
-              <w:t>Alanis Cristine Barros</w:t>
+              <w:t>Andrey Eduardo Malinoscky</w:t>
             </w:r>
           </w:p>
         </w:tc>
@@ -1316,7 +1268,7 @@
           </w:tcPr>
           <w:p>
             <w:r>
-              <w:t>Bhianca Moro Portella</w:t>
+              <w:t>Evanir Pavloski</w:t>
             </w:r>
           </w:p>
         </w:tc>
@@ -1326,7 +1278,7 @@
           </w:tcPr>
           <w:p>
             <w:r>
-              <w:t xml:space="preserve">João Victor Chiquetto Silva, Ana Letícia Carneiro de Oliveira, Fabiana Simeoni Avais (Co-orientadora) </w:t>
+              <w:t>Membros: Giuliano Lellis Ito Santos, Keli Cristina Pacheco</w:t>
             </w:r>
           </w:p>
         </w:tc>
@@ -1358,7 +1310,7 @@
           </w:tcPr>
           <w:p>
             <w:r>
-              <w:t>Isabela Fernandes</w:t>
+              <w:t>Julia  Soares Nadal</w:t>
             </w:r>
           </w:p>
         </w:tc>
@@ -1368,7 +1320,7 @@
           </w:tcPr>
           <w:p>
             <w:r>
-              <w:t>Daiane Cristina Pereira</w:t>
+              <w:t>Pascoalina Bailon de Oliveira Saleh</w:t>
             </w:r>
           </w:p>
         </w:tc>
@@ -1378,7 +1330,7 @@
           </w:tcPr>
           <w:p>
             <w:r>
-              <w:t>Giuliano Lellis Ito Santos , Eunice de Morais</w:t>
+              <w:t>Membros: João Victor Chiquetto Silva, Cloris Porto Torquato</w:t>
             </w:r>
           </w:p>
         </w:tc>
@@ -1391,6 +1343,430 @@
           <w:p>
             <w:r>
               <w:t>18:50</w:t>
+            </w:r>
+          </w:p>
+        </w:tc>
+        <w:tc>
+          <w:tcPr>
+            <w:tcW w:type="dxa" w:w="1728"/>
+          </w:tcPr>
+          <w:p>
+            <w:r>
+              <w:t>B209</w:t>
+            </w:r>
+          </w:p>
+        </w:tc>
+        <w:tc>
+          <w:tcPr>
+            <w:tcW w:type="dxa" w:w="1728"/>
+          </w:tcPr>
+          <w:p>
+            <w:r>
+              <w:t>Andréia Rosane Bueno da Silva</w:t>
+            </w:r>
+          </w:p>
+        </w:tc>
+        <w:tc>
+          <w:tcPr>
+            <w:tcW w:type="dxa" w:w="1728"/>
+          </w:tcPr>
+          <w:p>
+            <w:r>
+              <w:t>Vinícius Heitor Pereira</w:t>
+            </w:r>
+          </w:p>
+        </w:tc>
+        <w:tc>
+          <w:tcPr>
+            <w:tcW w:type="dxa" w:w="1728"/>
+          </w:tcPr>
+          <w:p>
+            <w:r>
+              <w:t>Membros: Katherine Fischer, Carlos André Ferreira</w:t>
+              <w:br/>
+              <w:t>TILSP: Cristiane Ribeiro Rocha</w:t>
+            </w:r>
+          </w:p>
+        </w:tc>
+      </w:tr>
+      <w:tr>
+        <w:tc>
+          <w:tcPr>
+            <w:tcW w:type="dxa" w:w="1728"/>
+          </w:tcPr>
+          <w:p>
+            <w:r>
+              <w:t>18:50</w:t>
+            </w:r>
+          </w:p>
+        </w:tc>
+        <w:tc>
+          <w:tcPr>
+            <w:tcW w:type="dxa" w:w="1728"/>
+          </w:tcPr>
+          <w:p>
+            <w:r>
+              <w:t>B210</w:t>
+            </w:r>
+          </w:p>
+        </w:tc>
+        <w:tc>
+          <w:tcPr>
+            <w:tcW w:type="dxa" w:w="1728"/>
+          </w:tcPr>
+          <w:p>
+            <w:r>
+              <w:t>ALÍA REBECA MOREIRA E SUBTIL</w:t>
+            </w:r>
+          </w:p>
+        </w:tc>
+        <w:tc>
+          <w:tcPr>
+            <w:tcW w:type="dxa" w:w="1728"/>
+          </w:tcPr>
+          <w:p>
+            <w:r>
+              <w:t>Charlott Eloize Leviski</w:t>
+            </w:r>
+          </w:p>
+        </w:tc>
+        <w:tc>
+          <w:tcPr>
+            <w:tcW w:type="dxa" w:w="1728"/>
+          </w:tcPr>
+          <w:p>
+            <w:r>
+              <w:t>Membros: Fabiana Simeoni Avais, Bhianca Moro Portella</w:t>
+            </w:r>
+          </w:p>
+        </w:tc>
+      </w:tr>
+      <w:tr>
+        <w:tc>
+          <w:tcPr>
+            <w:tcW w:type="dxa" w:w="1728"/>
+          </w:tcPr>
+          <w:p>
+            <w:r>
+              <w:t>18:50</w:t>
+            </w:r>
+          </w:p>
+        </w:tc>
+        <w:tc>
+          <w:tcPr>
+            <w:tcW w:type="dxa" w:w="1728"/>
+          </w:tcPr>
+          <w:p>
+            <w:r>
+              <w:t>B214</w:t>
+            </w:r>
+          </w:p>
+        </w:tc>
+        <w:tc>
+          <w:tcPr>
+            <w:tcW w:type="dxa" w:w="1728"/>
+          </w:tcPr>
+          <w:p>
+            <w:r>
+              <w:t>Lohan Vinícius de Oliveira</w:t>
+            </w:r>
+          </w:p>
+        </w:tc>
+        <w:tc>
+          <w:tcPr>
+            <w:tcW w:type="dxa" w:w="1728"/>
+          </w:tcPr>
+          <w:p>
+            <w:r>
+              <w:t>Daniel van der Broocke de Oliveira Gomes</w:t>
+            </w:r>
+          </w:p>
+        </w:tc>
+        <w:tc>
+          <w:tcPr>
+            <w:tcW w:type="dxa" w:w="1728"/>
+          </w:tcPr>
+          <w:p>
+            <w:r>
+              <w:t>Membros: Jane Kelly de Oliveira, Eduardo Reis de Mello</w:t>
+            </w:r>
+          </w:p>
+        </w:tc>
+      </w:tr>
+      <w:tr>
+        <w:tc>
+          <w:tcPr>
+            <w:tcW w:type="dxa" w:w="1728"/>
+          </w:tcPr>
+          <w:p>
+            <w:r>
+              <w:t>20:00</w:t>
+            </w:r>
+          </w:p>
+        </w:tc>
+        <w:tc>
+          <w:tcPr>
+            <w:tcW w:type="dxa" w:w="1728"/>
+          </w:tcPr>
+          <w:p>
+            <w:r>
+              <w:t>B201</w:t>
+            </w:r>
+          </w:p>
+        </w:tc>
+        <w:tc>
+          <w:tcPr>
+            <w:tcW w:type="dxa" w:w="1728"/>
+          </w:tcPr>
+          <w:p>
+            <w:r>
+              <w:t>Nicole Cristina Pokczyva</w:t>
+            </w:r>
+          </w:p>
+        </w:tc>
+        <w:tc>
+          <w:tcPr>
+            <w:tcW w:type="dxa" w:w="1728"/>
+          </w:tcPr>
+          <w:p>
+            <w:r>
+              <w:t>Andréa Correa Paraiso Müller</w:t>
+            </w:r>
+          </w:p>
+        </w:tc>
+        <w:tc>
+          <w:tcPr>
+            <w:tcW w:type="dxa" w:w="1728"/>
+          </w:tcPr>
+          <w:p>
+            <w:r>
+              <w:t>Membros: Daiane Cristina Pereira, Paola Scheifer</w:t>
+            </w:r>
+          </w:p>
+        </w:tc>
+      </w:tr>
+      <w:tr>
+        <w:tc>
+          <w:tcPr>
+            <w:tcW w:type="dxa" w:w="1728"/>
+          </w:tcPr>
+          <w:p>
+            <w:r>
+              <w:t>20:00</w:t>
+            </w:r>
+          </w:p>
+        </w:tc>
+        <w:tc>
+          <w:tcPr>
+            <w:tcW w:type="dxa" w:w="1728"/>
+          </w:tcPr>
+          <w:p>
+            <w:r>
+              <w:t>B202</w:t>
+            </w:r>
+          </w:p>
+        </w:tc>
+        <w:tc>
+          <w:tcPr>
+            <w:tcW w:type="dxa" w:w="1728"/>
+          </w:tcPr>
+          <w:p>
+            <w:r>
+              <w:t>Giulliana Pinheiro</w:t>
+            </w:r>
+          </w:p>
+        </w:tc>
+        <w:tc>
+          <w:tcPr>
+            <w:tcW w:type="dxa" w:w="1728"/>
+          </w:tcPr>
+          <w:p>
+            <w:r>
+              <w:t>Patricia Barreto Mainardi Maeso</w:t>
+            </w:r>
+          </w:p>
+        </w:tc>
+        <w:tc>
+          <w:tcPr>
+            <w:tcW w:type="dxa" w:w="1728"/>
+          </w:tcPr>
+          <w:p>
+            <w:r>
+              <w:t>Membros: Isabel Cristina Vollet Marson, Deborah Scheidt</w:t>
+            </w:r>
+          </w:p>
+        </w:tc>
+      </w:tr>
+      <w:tr>
+        <w:tc>
+          <w:tcPr>
+            <w:tcW w:type="dxa" w:w="1728"/>
+          </w:tcPr>
+          <w:p>
+            <w:r>
+              <w:t>20:00</w:t>
+            </w:r>
+          </w:p>
+        </w:tc>
+        <w:tc>
+          <w:tcPr>
+            <w:tcW w:type="dxa" w:w="1728"/>
+          </w:tcPr>
+          <w:p>
+            <w:r>
+              <w:t>B203</w:t>
+            </w:r>
+          </w:p>
+        </w:tc>
+        <w:tc>
+          <w:tcPr>
+            <w:tcW w:type="dxa" w:w="1728"/>
+          </w:tcPr>
+          <w:p>
+            <w:r>
+              <w:t>PALOMA TEIXEIRA DE OLIVEIRA</w:t>
+            </w:r>
+          </w:p>
+        </w:tc>
+        <w:tc>
+          <w:tcPr>
+            <w:tcW w:type="dxa" w:w="1728"/>
+          </w:tcPr>
+          <w:p>
+            <w:r>
+              <w:t>Andressa França</w:t>
+            </w:r>
+          </w:p>
+        </w:tc>
+        <w:tc>
+          <w:tcPr>
+            <w:tcW w:type="dxa" w:w="1728"/>
+          </w:tcPr>
+          <w:p>
+            <w:r>
+              <w:t>Membros: Maria Auxiliadora Bezerra de Araújo, Joyce Cristina Souza</w:t>
+              <w:br/>
+              <w:t>TILSP: Marcelo Oliveira Bleme</w:t>
+            </w:r>
+          </w:p>
+        </w:tc>
+      </w:tr>
+      <w:tr>
+        <w:tc>
+          <w:tcPr>
+            <w:tcW w:type="dxa" w:w="1728"/>
+          </w:tcPr>
+          <w:p>
+            <w:r>
+              <w:t>20:00</w:t>
+            </w:r>
+          </w:p>
+        </w:tc>
+        <w:tc>
+          <w:tcPr>
+            <w:tcW w:type="dxa" w:w="1728"/>
+          </w:tcPr>
+          <w:p>
+            <w:r>
+              <w:t>B207</w:t>
+            </w:r>
+          </w:p>
+        </w:tc>
+        <w:tc>
+          <w:tcPr>
+            <w:tcW w:type="dxa" w:w="1728"/>
+          </w:tcPr>
+          <w:p>
+            <w:r>
+              <w:t>Oziel dos Santos Martins</w:t>
+            </w:r>
+          </w:p>
+        </w:tc>
+        <w:tc>
+          <w:tcPr>
+            <w:tcW w:type="dxa" w:w="1728"/>
+          </w:tcPr>
+          <w:p>
+            <w:r>
+              <w:t>Rosana Apolonia Harmuch</w:t>
+            </w:r>
+          </w:p>
+        </w:tc>
+        <w:tc>
+          <w:tcPr>
+            <w:tcW w:type="dxa" w:w="1728"/>
+          </w:tcPr>
+          <w:p>
+            <w:r>
+              <w:t>Membros: Bianca Meira Lopes, Marco Aurélio de Souza</w:t>
+            </w:r>
+          </w:p>
+        </w:tc>
+      </w:tr>
+      <w:tr>
+        <w:tc>
+          <w:tcPr>
+            <w:tcW w:type="dxa" w:w="1728"/>
+          </w:tcPr>
+          <w:p>
+            <w:r>
+              <w:t>20:00</w:t>
+            </w:r>
+          </w:p>
+        </w:tc>
+        <w:tc>
+          <w:tcPr>
+            <w:tcW w:type="dxa" w:w="1728"/>
+          </w:tcPr>
+          <w:p>
+            <w:r>
+              <w:t>B208</w:t>
+            </w:r>
+          </w:p>
+        </w:tc>
+        <w:tc>
+          <w:tcPr>
+            <w:tcW w:type="dxa" w:w="1728"/>
+          </w:tcPr>
+          <w:p>
+            <w:r>
+              <w:t>SERGIO DE SOUZA CAMPISTA JUNIOR</w:t>
+            </w:r>
+          </w:p>
+        </w:tc>
+        <w:tc>
+          <w:tcPr>
+            <w:tcW w:type="dxa" w:w="1728"/>
+          </w:tcPr>
+          <w:p>
+            <w:r>
+              <w:t xml:space="preserve">Rúbia Carla da Silva </w:t>
+            </w:r>
+          </w:p>
+        </w:tc>
+        <w:tc>
+          <w:tcPr>
+            <w:tcW w:type="dxa" w:w="1728"/>
+          </w:tcPr>
+          <w:p>
+            <w:r>
+              <w:t>Coorientador(a): Djane Antonucci Correa</w:t>
+              <w:br/>
+              <w:t>Membros: Cloris Porto Torquato, Katherine Fischer</w:t>
+              <w:br/>
+              <w:t>TILSP: Valdemir Pontes Vieira</w:t>
+            </w:r>
+          </w:p>
+        </w:tc>
+      </w:tr>
+      <w:tr>
+        <w:tc>
+          <w:tcPr>
+            <w:tcW w:type="dxa" w:w="1728"/>
+          </w:tcPr>
+          <w:p>
+            <w:r>
+              <w:t>20:00</w:t>
             </w:r>
           </w:p>
         </w:tc>
@@ -1430,59 +1806,7 @@
           </w:tcPr>
           <w:p>
             <w:r>
-              <w:t>Lincoln Felipe Freitas, Charlott Eloize Leviski</w:t>
-            </w:r>
-          </w:p>
-        </w:tc>
-      </w:tr>
-      <w:tr>
-        <w:tc>
-          <w:tcPr>
-            <w:tcW w:type="dxa" w:w="1728"/>
-          </w:tcPr>
-          <w:p>
-            <w:r>
-              <w:t>18:50</w:t>
-            </w:r>
-          </w:p>
-        </w:tc>
-        <w:tc>
-          <w:tcPr>
-            <w:tcW w:type="dxa" w:w="1728"/>
-          </w:tcPr>
-          <w:p>
-            <w:r>
-              <w:t>B214</w:t>
-            </w:r>
-          </w:p>
-        </w:tc>
-        <w:tc>
-          <w:tcPr>
-            <w:tcW w:type="dxa" w:w="1728"/>
-          </w:tcPr>
-          <w:p>
-            <w:r>
-              <w:t>ESTELA MARTINS EIDAM</w:t>
-            </w:r>
-          </w:p>
-        </w:tc>
-        <w:tc>
-          <w:tcPr>
-            <w:tcW w:type="dxa" w:w="1728"/>
-          </w:tcPr>
-          <w:p>
-            <w:r>
-              <w:t>Valeska Gracioso Carlos</w:t>
-            </w:r>
-          </w:p>
-        </w:tc>
-        <w:tc>
-          <w:tcPr>
-            <w:tcW w:type="dxa" w:w="1728"/>
-          </w:tcPr>
-          <w:p>
-            <w:r>
-              <w:t xml:space="preserve">Lucimar Araujo Braga, Marina Zavadzki </w:t>
+              <w:t>Membros: Lincoln Felipe Freitas, Charlott Eloize Leviski</w:t>
             </w:r>
           </w:p>
         </w:tc>
@@ -1504,7 +1828,7 @@
           </w:tcPr>
           <w:p>
             <w:r>
-              <w:t>B201</w:t>
+              <w:t>B214</w:t>
             </w:r>
           </w:p>
         </w:tc>
@@ -1514,7 +1838,7 @@
           </w:tcPr>
           <w:p>
             <w:r>
-              <w:t>Ana Julia Ruths de Castro</w:t>
+              <w:t>Jackson Yuri Machado de Paula</w:t>
             </w:r>
           </w:p>
         </w:tc>
@@ -1524,7 +1848,7 @@
           </w:tcPr>
           <w:p>
             <w:r>
-              <w:t>Evanir Pavloski</w:t>
+              <w:t>Eunice de Morais</w:t>
             </w:r>
           </w:p>
         </w:tc>
@@ -1534,7 +1858,7 @@
           </w:tcPr>
           <w:p>
             <w:r>
-              <w:t>Deborah Scheidt, Eunice de Morais</w:t>
+              <w:t>Membros: Leonardo S. Carrera Guisantes, Fatima Maria Aparecida Ruvinski Kusma</w:t>
             </w:r>
           </w:p>
         </w:tc>
@@ -1546,7 +1870,7 @@
           </w:tcPr>
           <w:p>
             <w:r>
-              <w:t>20:00</w:t>
+              <w:t>21:05</w:t>
             </w:r>
           </w:p>
         </w:tc>
@@ -1556,7 +1880,7 @@
           </w:tcPr>
           <w:p>
             <w:r>
-              <w:t>B202</w:t>
+              <w:t>B201</w:t>
             </w:r>
           </w:p>
         </w:tc>
@@ -1566,7 +1890,7 @@
           </w:tcPr>
           <w:p>
             <w:r>
-              <w:t>Lohan Vinícius de Oliveira</w:t>
+              <w:t>Estefany Ferreira Carvalho</w:t>
             </w:r>
           </w:p>
         </w:tc>
@@ -1576,7 +1900,7 @@
           </w:tcPr>
           <w:p>
             <w:r>
-              <w:t>Daniel van der Broocke de Oliveira Gomes</w:t>
+              <w:t>Rosangela Schardong</w:t>
             </w:r>
           </w:p>
         </w:tc>
@@ -1586,7 +1910,7 @@
           </w:tcPr>
           <w:p>
             <w:r>
-              <w:t>Jane Kelly de Oliveira, Eduardo Reis de Mello</w:t>
+              <w:t>Membros: Valeska Gracioso Carlos, Lincoln Felipe Freitas</w:t>
             </w:r>
           </w:p>
         </w:tc>
@@ -1598,7 +1922,7 @@
           </w:tcPr>
           <w:p>
             <w:r>
-              <w:t>20:00</w:t>
+              <w:t>21:05</w:t>
             </w:r>
           </w:p>
         </w:tc>
@@ -1638,319 +1962,9 @@
           </w:tcPr>
           <w:p>
             <w:r>
-              <w:t xml:space="preserve">Katherine Fischer, Rúbia Carla da Silva, TILSP - Valdemir </w:t>
-            </w:r>
-          </w:p>
-        </w:tc>
-      </w:tr>
-      <w:tr>
-        <w:tc>
-          <w:tcPr>
-            <w:tcW w:type="dxa" w:w="1728"/>
-          </w:tcPr>
-          <w:p>
-            <w:r>
-              <w:t>20:00</w:t>
-            </w:r>
-          </w:p>
-        </w:tc>
-        <w:tc>
-          <w:tcPr>
-            <w:tcW w:type="dxa" w:w="1728"/>
-          </w:tcPr>
-          <w:p>
-            <w:r>
-              <w:t>B207</w:t>
-            </w:r>
-          </w:p>
-        </w:tc>
-        <w:tc>
-          <w:tcPr>
-            <w:tcW w:type="dxa" w:w="1728"/>
-          </w:tcPr>
-          <w:p>
-            <w:r>
-              <w:t>ALÍA REBECA MOREIRA E SUBTIL</w:t>
-            </w:r>
-          </w:p>
-        </w:tc>
-        <w:tc>
-          <w:tcPr>
-            <w:tcW w:type="dxa" w:w="1728"/>
-          </w:tcPr>
-          <w:p>
-            <w:r>
-              <w:t>Charlott Eloize Leviski</w:t>
-            </w:r>
-          </w:p>
-        </w:tc>
-        <w:tc>
-          <w:tcPr>
-            <w:tcW w:type="dxa" w:w="1728"/>
-          </w:tcPr>
-          <w:p>
-            <w:r>
-              <w:t>Fabiana Simeoni Avais, Bhianca Moro Portela</w:t>
-            </w:r>
-          </w:p>
-        </w:tc>
-      </w:tr>
-      <w:tr>
-        <w:tc>
-          <w:tcPr>
-            <w:tcW w:type="dxa" w:w="1728"/>
-          </w:tcPr>
-          <w:p>
-            <w:r>
-              <w:t>20:00</w:t>
-            </w:r>
-          </w:p>
-        </w:tc>
-        <w:tc>
-          <w:tcPr>
-            <w:tcW w:type="dxa" w:w="1728"/>
-          </w:tcPr>
-          <w:p>
-            <w:r>
-              <w:t>B208</w:t>
-            </w:r>
-          </w:p>
-        </w:tc>
-        <w:tc>
-          <w:tcPr>
-            <w:tcW w:type="dxa" w:w="1728"/>
-          </w:tcPr>
-          <w:p>
-            <w:r>
-              <w:t>Naiane Maria de Lima</w:t>
-            </w:r>
-          </w:p>
-        </w:tc>
-        <w:tc>
-          <w:tcPr>
-            <w:tcW w:type="dxa" w:w="1728"/>
-          </w:tcPr>
-          <w:p>
-            <w:r>
-              <w:t>Silvana Oliveira</w:t>
-            </w:r>
-          </w:p>
-        </w:tc>
-        <w:tc>
-          <w:tcPr>
-            <w:tcW w:type="dxa" w:w="1728"/>
-          </w:tcPr>
-          <w:p>
-            <w:r>
-              <w:t>LINCOLN FELIPE FREITAS, Daiane Cristina Pereira</w:t>
-            </w:r>
-          </w:p>
-        </w:tc>
-      </w:tr>
-      <w:tr>
-        <w:tc>
-          <w:tcPr>
-            <w:tcW w:type="dxa" w:w="1728"/>
-          </w:tcPr>
-          <w:p>
-            <w:r>
-              <w:t>20:00</w:t>
-            </w:r>
-          </w:p>
-        </w:tc>
-        <w:tc>
-          <w:tcPr>
-            <w:tcW w:type="dxa" w:w="1728"/>
-          </w:tcPr>
-          <w:p>
-            <w:r>
-              <w:t>B210</w:t>
-            </w:r>
-          </w:p>
-        </w:tc>
-        <w:tc>
-          <w:tcPr>
-            <w:tcW w:type="dxa" w:w="1728"/>
-          </w:tcPr>
-          <w:p>
-            <w:r>
-              <w:t>Oziel dos Santos Martins</w:t>
-            </w:r>
-          </w:p>
-        </w:tc>
-        <w:tc>
-          <w:tcPr>
-            <w:tcW w:type="dxa" w:w="1728"/>
-          </w:tcPr>
-          <w:p>
-            <w:r>
-              <w:t>Rosana Apolonia Harmuch</w:t>
-            </w:r>
-          </w:p>
-        </w:tc>
-        <w:tc>
-          <w:tcPr>
-            <w:tcW w:type="dxa" w:w="1728"/>
-          </w:tcPr>
-          <w:p>
-            <w:r>
-              <w:t>Bianca Meira Lopes, Marco Aurélio de Souza</w:t>
-            </w:r>
-          </w:p>
-        </w:tc>
-      </w:tr>
-      <w:tr>
-        <w:tc>
-          <w:tcPr>
-            <w:tcW w:type="dxa" w:w="1728"/>
-          </w:tcPr>
-          <w:p>
-            <w:r>
-              <w:t>20:00</w:t>
-            </w:r>
-          </w:p>
-        </w:tc>
-        <w:tc>
-          <w:tcPr>
-            <w:tcW w:type="dxa" w:w="1728"/>
-          </w:tcPr>
-          <w:p>
-            <w:r>
-              <w:t>B214</w:t>
-            </w:r>
-          </w:p>
-        </w:tc>
-        <w:tc>
-          <w:tcPr>
-            <w:tcW w:type="dxa" w:w="1728"/>
-          </w:tcPr>
-          <w:p>
-            <w:r>
-              <w:t xml:space="preserve">João Luis Rodrigues  Machado </w:t>
-            </w:r>
-          </w:p>
-        </w:tc>
-        <w:tc>
-          <w:tcPr>
-            <w:tcW w:type="dxa" w:w="1728"/>
-          </w:tcPr>
-          <w:p>
-            <w:r>
-              <w:t>Pascoalina Bailon de Oliveira Saleh</w:t>
-            </w:r>
-          </w:p>
-        </w:tc>
-        <w:tc>
-          <w:tcPr>
-            <w:tcW w:type="dxa" w:w="1728"/>
-          </w:tcPr>
-          <w:p>
-            <w:r>
-              <w:t>Pascoalina Bailon de Oliveira Saleh, Cloris Porto Torquato, João Victor Chiquetto Silva</w:t>
-            </w:r>
-          </w:p>
-        </w:tc>
-      </w:tr>
-      <w:tr>
-        <w:tc>
-          <w:tcPr>
-            <w:tcW w:type="dxa" w:w="1728"/>
-          </w:tcPr>
-          <w:p>
-            <w:r>
-              <w:t>21:05</w:t>
-            </w:r>
-          </w:p>
-        </w:tc>
-        <w:tc>
-          <w:tcPr>
-            <w:tcW w:type="dxa" w:w="1728"/>
-          </w:tcPr>
-          <w:p>
-            <w:r>
-              <w:t>B201</w:t>
-            </w:r>
-          </w:p>
-        </w:tc>
-        <w:tc>
-          <w:tcPr>
-            <w:tcW w:type="dxa" w:w="1728"/>
-          </w:tcPr>
-          <w:p>
-            <w:r>
-              <w:t>Jackson Yuri Machado de Paula</w:t>
-            </w:r>
-          </w:p>
-        </w:tc>
-        <w:tc>
-          <w:tcPr>
-            <w:tcW w:type="dxa" w:w="1728"/>
-          </w:tcPr>
-          <w:p>
-            <w:r>
-              <w:t>Eunice de Morais</w:t>
-            </w:r>
-          </w:p>
-        </w:tc>
-        <w:tc>
-          <w:tcPr>
-            <w:tcW w:type="dxa" w:w="1728"/>
-          </w:tcPr>
-          <w:p>
-            <w:r>
-              <w:t>Leonardo S. Carrera Guisantes, Fatima Maria Aparecida Ruvinski Kusma (PPGEL)</w:t>
-            </w:r>
-          </w:p>
-        </w:tc>
-      </w:tr>
-      <w:tr>
-        <w:tc>
-          <w:tcPr>
-            <w:tcW w:type="dxa" w:w="1728"/>
-          </w:tcPr>
-          <w:p>
-            <w:r>
-              <w:t>21:05</w:t>
-            </w:r>
-          </w:p>
-        </w:tc>
-        <w:tc>
-          <w:tcPr>
-            <w:tcW w:type="dxa" w:w="1728"/>
-          </w:tcPr>
-          <w:p>
-            <w:r>
-              <w:t>B203</w:t>
-            </w:r>
-          </w:p>
-        </w:tc>
-        <w:tc>
-          <w:tcPr>
-            <w:tcW w:type="dxa" w:w="1728"/>
-          </w:tcPr>
-          <w:p>
-            <w:r>
-              <w:t>PALOMA TEIXEIRA DE OLIVEIRA</w:t>
-            </w:r>
-          </w:p>
-        </w:tc>
-        <w:tc>
-          <w:tcPr>
-            <w:tcW w:type="dxa" w:w="1728"/>
-          </w:tcPr>
-          <w:p>
-            <w:r>
-              <w:t>Andressa França</w:t>
-            </w:r>
-          </w:p>
-        </w:tc>
-        <w:tc>
-          <w:tcPr>
-            <w:tcW w:type="dxa" w:w="1728"/>
-          </w:tcPr>
-          <w:p>
-            <w:r>
-              <w:t>Maria Auxiliadora Bezerra de Araújo, Joyce Cristina Souza, TILSP Marcelo Bleme</w:t>
+              <w:t>Membros: Katherine Fischer, Rúbia Carla da Silva</w:t>
+              <w:br/>
+              <w:t>TILSP: Valdemir Pontes Vieira</w:t>
             </w:r>
           </w:p>
         </w:tc>
@@ -1982,7 +1996,7 @@
           </w:tcPr>
           <w:p>
             <w:r>
-              <w:t>CARLA ANDRESSA RODRIGUES DE ASSUNÇÃO</w:t>
+              <w:t>Isabela Fernandes</w:t>
             </w:r>
           </w:p>
         </w:tc>
@@ -1992,7 +2006,7 @@
           </w:tcPr>
           <w:p>
             <w:r>
-              <w:t>Marcos Barbosa Carreira</w:t>
+              <w:t>Daiane Cristina Pereira</w:t>
             </w:r>
           </w:p>
         </w:tc>
@@ -2002,7 +2016,7 @@
           </w:tcPr>
           <w:p>
             <w:r>
-              <w:t xml:space="preserve">Diogo Simão, Álvaro Kasuaki Fujihara, Fabiana Simeoni Avais (Co-orientadora) </w:t>
+              <w:t>Membros: Giuliano Lellis Ito Santos, Eunice de Morais</w:t>
             </w:r>
           </w:p>
         </w:tc>
@@ -2034,7 +2048,7 @@
           </w:tcPr>
           <w:p>
             <w:r>
-              <w:t>Nicole Cristina Pokczyva</w:t>
+              <w:t xml:space="preserve">João Luis Rodrigues  Machado </w:t>
             </w:r>
           </w:p>
         </w:tc>
@@ -2044,7 +2058,7 @@
           </w:tcPr>
           <w:p>
             <w:r>
-              <w:t>Andréa Correa Paraiso Müller</w:t>
+              <w:t>Pascoalina Bailon de Oliveira Saleh</w:t>
             </w:r>
           </w:p>
         </w:tc>
@@ -2054,7 +2068,7 @@
           </w:tcPr>
           <w:p>
             <w:r>
-              <w:t>Daiane Cristina Pereira, Paola Scheifer</w:t>
+              <w:t>Membros: João Victor Chiquetto Silva, Cloris Porto Torquato</w:t>
             </w:r>
           </w:p>
         </w:tc>
@@ -2106,7 +2120,7 @@
           </w:tcPr>
           <w:p>
             <w:r>
-              <w:t>Déborah Scheidt, Diego Gomes do Valle</w:t>
+              <w:t>Membros: Deborah Scheidt, Diego Gomes do Valle</w:t>
             </w:r>
           </w:p>
         </w:tc>
@@ -2138,7 +2152,7 @@
           </w:tcPr>
           <w:p>
             <w:r>
-              <w:t>Julia  Soares Nadal</w:t>
+              <w:t>Joseanne Kanufre Pires Ferreira</w:t>
             </w:r>
           </w:p>
         </w:tc>
@@ -2148,7 +2162,7 @@
           </w:tcPr>
           <w:p>
             <w:r>
-              <w:t>Pascoalina Bailon de Oliveira Saleh</w:t>
+              <w:t>Andréa Correa Paraiso Müller</w:t>
             </w:r>
           </w:p>
         </w:tc>
@@ -2158,7 +2172,7 @@
           </w:tcPr>
           <w:p>
             <w:r>
-              <w:t>Pascoalina Bailon de Oliveira Saleh, Cloris Porto Torquato, João Victor Chiquetto Silva</w:t>
+              <w:t>Membros: Juliana Ristow Canuto, Jannefer Desselman</w:t>
             </w:r>
           </w:p>
         </w:tc>

</xml_diff>